<commit_message>
Update portfolio and resume with latest experience.
Add Archiot Digital Solutions role, refresh bio metrics, and replace downloadable resume.

Co-authored-by: Cursor <cursoragent@cursor.com>
</commit_message>
<xml_diff>
--- a/public/Levin_Sekhar_Resume.docx
+++ b/public/Levin_Sekhar_Resume.docx
@@ -29,7 +29,7 @@
           <w:sz w:val="22"/>
           <w:szCs w:val="22"/>
         </w:rPr>
-        <w:t xml:space="preserve">Data Engineer | Cloud Data Platforms &amp; Pipeline Engineering</w:t>
+        <w:t xml:space="preserve">Data Engineer</w:t>
       </w:r>
     </w:p>
     <w:p>
@@ -114,7 +114,7 @@
           <w:sz w:val="20"/>
           <w:szCs w:val="20"/>
         </w:rPr>
-        <w:t xml:space="preserve"> processing 200,000+ records/day.</w:t>
+        <w:t xml:space="preserve"> processing 70M+ records annually.</w:t>
       </w:r>
     </w:p>
     <w:p>
@@ -562,14 +562,14 @@
           <w:sz w:val="20"/>
           <w:szCs w:val="20"/>
         </w:rPr>
-        <w:t xml:space="preserve">200,000+ records/day</w:t>
-      </w:r>
-      <w:r>
-        <w:rPr>
-          <w:sz w:val="20"/>
-          <w:szCs w:val="20"/>
-        </w:rPr>
-        <w:t xml:space="preserve">, landing raw pharmacy/clinical data through </w:t>
+        <w:t xml:space="preserve">70M+ records annually</w:t>
+      </w:r>
+      <w:r>
+        <w:rPr>
+          <w:sz w:val="20"/>
+          <w:szCs w:val="20"/>
+        </w:rPr>
+        <w:t xml:space="preserve"> (200K+ daily), landing raw pharmacy/clinical data through </w:t>
       </w:r>
       <w:r>
         <w:rPr>
@@ -962,6 +962,104 @@
           <w:szCs w:val="20"/>
         </w:rPr>
         <w:t xml:space="preserve">Implemented data transformation and standardization scripts across on-prem and cloud Spark platforms to meet federal healthcare transparency reporting requirements, delivering submission-ready outputs for government portals.</w:t>
+      </w:r>
+    </w:p>
+    <w:p>
+      <w:pPr>
+        <w:spacing w:after="20" w:before="200"/>
+      </w:pPr>
+      <w:r>
+        <w:rPr>
+          <w:b/>
+          <w:bCs/>
+          <w:color w:val="1F3864"/>
+          <w:sz w:val="22"/>
+          <w:szCs w:val="22"/>
+        </w:rPr>
+        <w:t xml:space="preserve">Archiot Digital Solutions Private Limited — Software Engineer</w:t>
+      </w:r>
+    </w:p>
+    <w:p>
+      <w:pPr>
+        <w:spacing w:after="60"/>
+      </w:pPr>
+      <w:r>
+        <w:rPr>
+          <w:i/>
+          <w:iCs/>
+          <w:color w:val="333333"/>
+          <w:sz w:val="20"/>
+          <w:szCs w:val="20"/>
+        </w:rPr>
+        <w:t xml:space="preserve">Jun 2022 – Jul 2023</w:t>
+      </w:r>
+    </w:p>
+    <w:p>
+      <w:pPr>
+        <w:pStyle w:val="ListParagraph"/>
+        <w:numPr>
+          <w:ilvl w:val="0"/>
+          <w:numId w:val="2"/>
+        </w:numPr>
+        <w:spacing w:after="60"/>
+      </w:pPr>
+      <w:r>
+        <w:rPr>
+          <w:sz w:val="20"/>
+          <w:szCs w:val="20"/>
+        </w:rPr>
+        <w:t xml:space="preserve">Developed and customized business applications using Microsoft PowerApps, SharePoint, and Power Automate, streamlining internal workflows across teams.</w:t>
+      </w:r>
+    </w:p>
+    <w:p>
+      <w:pPr>
+        <w:pStyle w:val="ListParagraph"/>
+        <w:numPr>
+          <w:ilvl w:val="0"/>
+          <w:numId w:val="2"/>
+        </w:numPr>
+        <w:spacing w:after="60"/>
+      </w:pPr>
+      <w:r>
+        <w:rPr>
+          <w:sz w:val="20"/>
+          <w:szCs w:val="20"/>
+        </w:rPr>
+        <w:t xml:space="preserve">Administered the Microsoft 365 environment (Exchange, Intune, Azure AD) and built both canvas and model-driven PowerApps, including enhancements to existing applications.</w:t>
+      </w:r>
+    </w:p>
+    <w:p>
+      <w:pPr>
+        <w:pStyle w:val="ListParagraph"/>
+        <w:numPr>
+          <w:ilvl w:val="0"/>
+          <w:numId w:val="2"/>
+        </w:numPr>
+        <w:spacing w:after="60"/>
+      </w:pPr>
+      <w:r>
+        <w:rPr>
+          <w:sz w:val="20"/>
+          <w:szCs w:val="20"/>
+        </w:rPr>
+        <w:t xml:space="preserve">Reviewed application designs, coordinated task progress with stakeholders and team leads, and tested/debugged applications prior to release.</w:t>
+      </w:r>
+    </w:p>
+    <w:p>
+      <w:pPr>
+        <w:pStyle w:val="ListParagraph"/>
+        <w:numPr>
+          <w:ilvl w:val="0"/>
+          <w:numId w:val="2"/>
+        </w:numPr>
+        <w:spacing w:after="60"/>
+      </w:pPr>
+      <w:r>
+        <w:rPr>
+          <w:sz w:val="20"/>
+          <w:szCs w:val="20"/>
+        </w:rPr>
+        <w:t xml:space="preserve">Delivered ongoing production support and maintenance for deployed business solutions, translating business requirements into technical implementations.</w:t>
       </w:r>
     </w:p>
     <w:p>

</xml_diff>